<commit_message>
Prospective validation (20 fresh data sets): results, analysis, fresh-data figure; v2 manuscript Section 7 and abstract
Pre-specified tests: P3 (fix non-inferior) supported for all learners; P2 (bound) held in 20/20
for RF and LightGBM; P1 (rank correlation, RF) not supported (rho 0.12, Holm p 0.31); P4 in the
predicted direction but not significant after Holm (p 0.062); P5 not established. All reported.

Co-Authored-By: Claude Opus 5.5 <noreply@anthropic.com>
Claude-Session: https://claude.ai/code/session_011swGQJjskr3eenk5bukhrn
</commit_message>
<xml_diff>
--- a/manuscript/Revised_Manuscript.docx
+++ b/manuscript/Revised_Manuscript.docx
@@ -133,7 +133,7 @@
         <w:t xml:space="preserve"> </w:t>
       </w:r>
       <w:r>
-        <w:t xml:space="preserve">Conformal prediction wraps a machine-learning model so that its prediction sets contain the true answer at a promised rate, for example 90% of the time. Practitioners usually confirm this promise on a random test split. Tabular data, however, often contain repeated rows, and a random split then places copies of many test rows in the training data. The check averages over these easy repeats and genuinely new cases, so it can report 90% while new cases, the ones that matter after deployment, are covered far less often. We propose a three-step routine: check, fix, report. The check counts repeated rows and whether they agree on the label, and predicts the worst-case shortfall before any model is trained. The fix calibrates seen and new cases separately, which restores the promised coverage for new cases. The report states coverage on new cases next to the usual figure. In software-defect prediction, a random forest’s sets reported 91.7% coverage but covered only 62.7% of new modules; after the fix, 90.3%. Similar shortfalls appeared in phishing and network-intrusion data. Across 103 benchmark data sets the problem was usually small, and the check said so. XX PROSPECTIVE SENTENCE XX The routine takes seconds and needs no change to the model.</w:t>
+        <w:t xml:space="preserve">Conformal prediction wraps a machine-learning model so that its prediction sets contain the true answer at a promised rate, for example 90% of the time. Practitioners usually confirm this promise on a random test split. Tabular data, however, often contain repeated rows, and a random split then places copies of many test rows in the training data. The check averages over these easy repeats and genuinely new cases, so it can report 90% while new cases, the ones that matter after deployment, are covered far less often. We propose a three-step routine: check, fix, report. The check counts repeated rows and whether they agree on the label, and predicts the worst-case shortfall before any model is trained. The fix calibrates seen and new cases separately, which restores the promised coverage for new cases. The report states coverage on new cases next to the usual figure. In software-defect prediction, a random forest’s sets reported 91.7% coverage but covered only 62.7% of new modules; after the fix, 90.3%. Similar shortfalls appeared in phishing and network-intrusion data. Across 103 benchmark data sets the problem was usually small, and the check said so. On 20 fresh data sets analysed under a plan fixed in advance, the fix kept new-case coverage on target and the check separated safe from risky data, although it did not rank data sets by severity. The routine takes seconds and needs no change to the model.</w:t>
       </w:r>
     </w:p>
     <w:p>
@@ -2629,7 +2629,7 @@
         <w:t xml:space="preserve"> </w:t>
       </w:r>
       <w:r>
-        <w:t xml:space="preserve">The two largest NASA sets, mc1 and pc2, consist mostly of repeated modules: with a random split, about 0.82 of the test modules in mc1 have an exact copy in the training data. The usual evaluation looks fine. The random forest’s 90% sets were right for 91.7% of test modules in mc1 and 91.0% in pc2. On genuinely new modules they were right only 62.7% and 62.5% of the time. The check flags both sets before any model is trained: its predicted worst-case shortfalls are −42.8 and −38.8 percentage points (pp). The actual shortfalls are smaller than this worst case, as expected for a model that does not memorize perfectly, but they are of the same order. Separate calibration brings coverage of new modules back to 90.3% and 89.4%.</w:t>
+        <w:t xml:space="preserve">The two largest NASA sets, mc1 and pc2, consist mostly of repeated modules: with a random split, about 82% of the test modules in mc1 have an exact copy in the training data. The usual evaluation looks fine. The random forest’s 90% sets were right for 91.7% of test modules in mc1 and 91.0% in pc2. On genuinely new modules they were right only 62.7% and 62.5% of the time. The check flags both sets before any model is trained: its predicted worst-case gaps are −42.8 and −38.8 percentage points (pp). The actual gaps are smaller than this worst case, as expected for a model that does not memorize perfectly, but they are of the same order. Separate calibration brings coverage of new modules back to 90.3% and 89.4%.</w:t>
       </w:r>
     </w:p>
     <w:p>
@@ -2707,7 +2707,7 @@
         <w:t xml:space="preserve"> </w:t>
       </w:r>
       <w:r>
-        <w:t xml:space="preserve">The KDD Cup’99 data repeat the same connection records thousands of times, and about 0.61 of test connections have a training copy. The standard 90% sets covered 95.5% of all test connections but 88.6% of new ones. With separate calibration, new-connection coverage was 91.6%. Overall coverage above 90% is itself a warning sign here: thousands of identical calibration records produce tied scores, which makes the standard method conservative overall while it under-covers the new connections.</w:t>
+        <w:t xml:space="preserve">The KDD Cup’99 data repeat the same connection records thousands of times, and about 61% of test connections have a training copy. The standard 90% sets covered 95.5% of all test connections but 88.6% of new ones. With separate calibration, new-connection coverage was 91.6%. Overall coverage above 90% is itself a warning sign here: thousands of identical calibration records produce tied scores, which makes the standard method conservative overall while it under-covers the new connections.</w:t>
       </w:r>
     </w:p>
     <w:p>
@@ -2725,7 +2725,7 @@
         <w:t xml:space="preserve"> </w:t>
       </w:r>
       <w:r>
-        <w:t xml:space="preserve">In the PhishingWebsites data, websites are described by 30 coarse features, so different sites often share the same profile. About 0.57 of test sites have a training copy. Overall coverage was 89.9%, coverage on new sites 84.8%, and 90.1% after the fix.</w:t>
+        <w:t xml:space="preserve">In the PhishingWebsites data, websites are described by 30 coarse features, so different sites often share the same profile. About 57% of test sites have a training copy. Overall coverage was 89.9%, coverage on new sites 84.8%, and 90.1% after the fix.</w:t>
       </w:r>
     </w:p>
     <w:p>
@@ -2733,7 +2733,7 @@
         <w:pStyle w:val="BodyText"/>
       </w:pPr>
       <w:r>
-        <w:t xml:space="preserve">Across the 6 applications that the check flagged (predicted shortfall larger than 2 pp), the random forest’s coverage on new cases ranged from 62.5–89.8% before the fix and 89.4–94.5% after it. The cost is modest: new cases get somewhat larger sets, while seen cases keep small ones.</w:t>
+        <w:t xml:space="preserve">Across the 6 data sets that the check flagged (predicted gap worse than −2 pp), the random forest’s coverage on new cases ranged from 62.5–89.8% before the fix and 89.4–94.5% after it. A flag is a warning, not a certainty. The small kc3 set was flagged (−4.9 pp), but its new modules were covered at 89.8% even without the fix. Here the standard sets were conservative overall (93.1%), most likely because many identical calibration rows produce tied scores (see the intrusion data below), and this offset the expected shortfall. The fix then simply made the sets a little more cautious (94.5%). The cost is modest in general: new cases get somewhat larger sets, while seen cases keep small ones.</w:t>
       </w:r>
     </w:p>
     <w:p>
@@ -5922,14 +5922,14 @@
       <w:r>
         <w:drawing>
           <wp:inline>
-            <wp:extent cx="5334000" cy="2174671"/>
+            <wp:extent cx="5334000" cy="2133071"/>
             <wp:effectExtent b="0" l="0" r="0" t="0"/>
             <wp:docPr descr="Fig. 2 Copies added on purpose to data sets without repeats: median coverage gap on new cases (coverage − 90%) against the share of rows copied, for standard calibration (solid) and separate calibration (dotted)" title="" id="34" name="Picture"/>
             <a:graphic>
               <a:graphicData uri="http://schemas.openxmlformats.org/drawingml/2006/picture">
                 <pic:pic>
                   <pic:nvPicPr>
-                    <pic:cNvPr descr="Fig4.png" id="35" name="Picture"/>
+                    <pic:cNvPr descr="Fig_inject.png" id="35" name="Picture"/>
                     <pic:cNvPicPr>
                       <a:picLocks noChangeArrowheads="1" noChangeAspect="1"/>
                     </pic:cNvPicPr>
@@ -5943,7 +5943,7 @@
                   <pic:spPr bwMode="auto">
                     <a:xfrm>
                       <a:off x="0" y="0"/>
-                      <a:ext cx="5334000" cy="2174671"/>
+                      <a:ext cx="5334000" cy="2133071"/>
                     </a:xfrm>
                     <a:prstGeom prst="rect">
                       <a:avLst/>
@@ -6063,7 +6063,7 @@
     </w:p>
     <w:bookmarkEnd w:id="37"/>
     <w:bookmarkEnd w:id="38"/>
-    <w:bookmarkStart w:id="44" w:name="results-iii-fresh-data-and-near-copies"/>
+    <w:bookmarkStart w:id="47" w:name="results-iii-fresh-data-and-near-copies"/>
     <w:p>
       <w:pPr>
         <w:pStyle w:val="Heading1"/>
@@ -6081,7 +6081,7 @@
         <w:t xml:space="preserve">Results III: fresh data and near-copies</w:t>
       </w:r>
     </w:p>
-    <w:bookmarkStart w:id="39" w:name="a-fair-test-on-data-we-had-not-seen"/>
+    <w:bookmarkStart w:id="42" w:name="a-fair-test-on-data-we-had-not-seen"/>
     <w:p>
       <w:pPr>
         <w:pStyle w:val="Heading2"/>
@@ -6104,11 +6104,264 @@
         <w:pStyle w:val="FirstParagraph"/>
       </w:pPr>
       <w:r>
-        <w:t xml:space="preserve">XX VALIDATION XX</w:t>
-      </w:r>
-    </w:p>
-    <w:bookmarkEnd w:id="39"/>
-    <w:bookmarkStart w:id="43" w:name="when-copies-are-not-exact"/>
+        <w:t xml:space="preserve">The predicted-gap formula (3) was derived after we had seen the benchmark results, so the analyses above could flatter it. We therefore fixed the analysis plan in a time-stamped commit and then selected new data sets from two collections we had not used: the AutoML Benchmark (Gijsbers et al. 2024) and the tabular benchmark of Grinsztajn et al. (2022). The selection used no labels and no models. It kept data sets in which at least 1% of test rows are expected to be seen, and it dropped data sets we had already used, data sets that appear twice in these collections, and five whose download failed. This left 20 data sets (8 classification, 12 regression), each analysed with 20 random splits. The plan named five tests in advance. We report all of them, including the two that failed.</w:t>
+      </w:r>
+    </w:p>
+    <w:p>
+      <w:pPr>
+        <w:pStyle w:val="BodyText"/>
+      </w:pPr>
+      <w:r>
+        <w:rPr>
+          <w:iCs/>
+          <w:i/>
+        </w:rPr>
+        <w:t xml:space="preserve">The fix works on new data.</w:t>
+      </w:r>
+      <w:r>
+        <w:t xml:space="preserve"> </w:t>
+      </w:r>
+      <w:r>
+        <w:t xml:space="preserve">Separate calibration kept the coverage of new cases at the target for all three learners. The median gap was 0.0 pp for random forests (worst data set −0.7 pp), 0.0 pp for LightGBM (worst −0.9 pp) and 0.0 pp for the linear models (worst −0.5 pp). Without the fix, the worst data set fell −27.5 pp (random forest) and −33.3 pp (LightGBM) below target. The fix made new-case sets larger by a median factor of only 1.00, because on most of these data sets there was little to fix. In one data set (seattlecrime6) almost every test row is seen, and the fix returned the full set for new cases in 75.0% of splits, because too few new calibration rows existed to do anything else.</w:t>
+      </w:r>
+    </w:p>
+    <w:p>
+      <w:pPr>
+        <w:pStyle w:val="BodyText"/>
+      </w:pPr>
+      <w:r>
+        <w:rPr>
+          <w:iCs/>
+          <w:i/>
+        </w:rPr>
+        <w:t xml:space="preserve">The safety margin reduces unlucky splits.</w:t>
+      </w:r>
+      <w:r>
+        <w:t xml:space="preserve"> </w:t>
+      </w:r>
+      <w:r>
+        <w:t xml:space="preserve">With separate calibration, coverage of new cases fell below 87% in 4.2% of individual splits (random forest). With the safety margin this dropped to 0.5%, and similarly for the other learners (4.5% → 0.8% and 4.8% → 0.5%). The cost was sets about 1.04 times as large. Because most data sets had no unlucky splits at all, this planned test did not reach significance after correction for multiple testing (adjusted</w:t>
+      </w:r>
+      <w:r>
+        <w:t xml:space="preserve"> </w:t>
+      </w:r>
+      <m:oMath>
+        <m:r>
+          <m:t>p</m:t>
+        </m:r>
+      </m:oMath>
+      <w:r>
+        <w:t xml:space="preserve"> </w:t>
+      </w:r>
+      <w:r>
+        <w:t xml:space="preserve">= 0.062).</w:t>
+      </w:r>
+    </w:p>
+    <w:p>
+      <w:pPr>
+        <w:pStyle w:val="BodyText"/>
+      </w:pPr>
+      <w:r>
+        <w:rPr>
+          <w:iCs/>
+          <w:i/>
+        </w:rPr>
+        <w:t xml:space="preserve">The predicted gap works as a limit, not as a ranking.</w:t>
+      </w:r>
+      <w:r>
+        <w:t xml:space="preserve"> </w:t>
+      </w:r>
+      <w:r>
+        <w:t xml:space="preserve">In all 20 data sets, the random forest’s actual gap stayed within 2 pp of the predicted worst case or above it (100.0%; 95% CI 83.2–100.0%), as planned. LightGBM behaved the same, and the linear models had one exception, discussed below. However, the predicted gap did</w:t>
+      </w:r>
+      <w:r>
+        <w:t xml:space="preserve"> </w:t>
+      </w:r>
+      <w:r>
+        <w:rPr>
+          <w:bCs/>
+          <w:b/>
+        </w:rPr>
+        <w:t xml:space="preserve">not</w:t>
+      </w:r>
+      <w:r>
+        <w:t xml:space="preserve"> </w:t>
+      </w:r>
+      <w:r>
+        <w:t xml:space="preserve">rank the fresh data sets by how badly they fell short: the planned rank correlation for random forests was weak and not significant (</w:t>
+      </w:r>
+      <m:oMath>
+        <m:r>
+          <m:t>ρ</m:t>
+        </m:r>
+      </m:oMath>
+      <w:r>
+        <w:t xml:space="preserve"> </w:t>
+      </w:r>
+      <w:r>
+        <w:t xml:space="preserve">= 0.12,</w:t>
+      </w:r>
+      <w:r>
+        <w:t xml:space="preserve"> </w:t>
+      </w:r>
+      <m:oMath>
+        <m:r>
+          <m:t>p</m:t>
+        </m:r>
+      </m:oMath>
+      <w:r>
+        <w:t xml:space="preserve"> </w:t>
+      </w:r>
+      <w:r>
+        <w:t xml:space="preserve">= 0.307), and the advantage over exposure alone was not established (difference in</w:t>
+      </w:r>
+      <w:r>
+        <w:t xml:space="preserve"> </w:t>
+      </w:r>
+      <m:oMath>
+        <m:r>
+          <m:t>ρ</m:t>
+        </m:r>
+      </m:oMath>
+      <w:r>
+        <w:t xml:space="preserve">, 95% CI −0.06 to 0.83). For LightGBM the correlation was 0.39 (</w:t>
+      </w:r>
+      <m:oMath>
+        <m:r>
+          <m:t>p</m:t>
+        </m:r>
+      </m:oMath>
+      <w:r>
+        <w:t xml:space="preserve"> </w:t>
+      </w:r>
+      <w:r>
+        <w:t xml:space="preserve">= 0.043, not corrected). Two things explain this. Most fresh data sets have essentially no shortfall, so their ranks are decided by noise. And on some of the most exposed classification sets the random forest was</w:t>
+      </w:r>
+      <w:r>
+        <w:t xml:space="preserve"> </w:t>
+      </w:r>
+      <w:r>
+        <w:rPr>
+          <w:iCs/>
+          <w:i/>
+        </w:rPr>
+        <w:t xml:space="preserve">conservative</w:t>
+      </w:r>
+      <w:r>
+        <w:t xml:space="preserve"> </w:t>
+      </w:r>
+      <w:r>
+        <w:t xml:space="preserve">on new cases instead of falling short. On airlines, for example, the predicted worst case was −5.5 pp but the observed gap was +8.7 pp, most likely because many identical calibration rows produce tied scores (Section 5).</w:t>
+      </w:r>
+    </w:p>
+    <w:p>
+      <w:pPr>
+        <w:pStyle w:val="BodyText"/>
+      </w:pPr>
+      <w:r>
+        <w:rPr>
+          <w:iCs/>
+          <w:i/>
+        </w:rPr>
+        <w:t xml:space="preserve">The check tells safe from unsafe data.</w:t>
+      </w:r>
+      <w:r>
+        <w:t xml:space="preserve"> </w:t>
+      </w:r>
+      <w:r>
+        <w:t xml:space="preserve">For a practitioner, ranking matters less than the decision</w:t>
+      </w:r>
+      <w:r>
+        <w:t xml:space="preserve"> </w:t>
+      </w:r>
+      <w:r>
+        <w:t xml:space="preserve">“</w:t>
+      </w:r>
+      <w:r>
+        <w:t xml:space="preserve">fix or not</w:t>
+      </w:r>
+      <w:r>
+        <w:t xml:space="preserve">”</w:t>
+      </w:r>
+      <w:r>
+        <w:t xml:space="preserve">. Here the check did well (Fig. 4). Before these results existed, our draft guidance said that a data set with a predicted gap no worse than −2 pp and fewer than 10% seen test rows needs no fix (Section 8.1). Of the fresh data sets, 9 met this rule, and none of them fell short by more than −1.0 pp with any learner. In the other direction, label purity removed false alarms that exposure alone would raise. In black_friday (63% seen test rows), seattlecrime6 (100%) and superconduct (33%), repeated rows almost never agree on the exact target, so purity predicts no shortfall even though exposure alone predicts −17.1, −90.0 and −5.0 pp. The random forest’s actual gaps were +1.8, +6.7 and −0.9 pp. Of the 10 data sets that exposure alone flags, the purity-based check flags 6, and among these are all data sets where the random forest or LightGBM fell more than 2 pp short (3 and 4 data sets). The clearest case is analcatdata_supreme, where 81% of test rows have a training copy with exactly the same target. The check predicted a worst case of −42.4 pp, and new cases were covered −27.5 pp (random forest) and −33.3 pp (LightGBM) off target.</w:t>
+      </w:r>
+    </w:p>
+    <w:p>
+      <w:pPr>
+        <w:pStyle w:val="BodyText"/>
+      </w:pPr>
+      <w:r>
+        <w:t xml:space="preserve">The one miss was a linear model on black_friday, which fell −3.7 pp short although the purity-based check predicted no problem. A linear model cannot memorize rows, so this shortfall is not the memorization effect the check is built for; exposure alone did flag this data set. This again suggests reading both numbers, as recommended in Section 8.1.</w:t>
+      </w:r>
+    </w:p>
+    <w:p>
+      <w:pPr>
+        <w:pStyle w:val="CaptionedFigure"/>
+      </w:pPr>
+      <w:r>
+        <w:drawing>
+          <wp:inline>
+            <wp:extent cx="3351780" cy="2623930"/>
+            <wp:effectExtent b="0" l="0" r="0" t="0"/>
+            <wp:docPr descr="Fig. 4 Fresh data sets, random forest. For each data set where exposure alone predicts a gap worse than −2 pp: the gap predicted from exposure only (circles), the gap predicted with label purity, Eq. (3) (diamonds), and the observed gap on new cases (bars). Shaded: within 2 pp of the target" title="" id="40" name="Picture"/>
+            <a:graphic>
+              <a:graphicData uri="http://schemas.openxmlformats.org/drawingml/2006/picture">
+                <pic:pic>
+                  <pic:nvPicPr>
+                    <pic:cNvPr descr="Fig_fresh.png" id="41" name="Picture"/>
+                    <pic:cNvPicPr>
+                      <a:picLocks noChangeArrowheads="1" noChangeAspect="1"/>
+                    </pic:cNvPicPr>
+                  </pic:nvPicPr>
+                  <pic:blipFill>
+                    <a:blip r:embed="rId39"/>
+                    <a:stretch>
+                      <a:fillRect/>
+                    </a:stretch>
+                  </pic:blipFill>
+                  <pic:spPr bwMode="auto">
+                    <a:xfrm>
+                      <a:off x="0" y="0"/>
+                      <a:ext cx="3351780" cy="2623930"/>
+                    </a:xfrm>
+                    <a:prstGeom prst="rect">
+                      <a:avLst/>
+                    </a:prstGeom>
+                    <a:noFill/>
+                    <a:ln w="9525">
+                      <a:noFill/>
+                      <a:headEnd/>
+                      <a:tailEnd/>
+                    </a:ln>
+                  </pic:spPr>
+                </pic:pic>
+              </a:graphicData>
+            </a:graphic>
+          </wp:inline>
+        </w:drawing>
+      </w:r>
+    </w:p>
+    <w:p>
+      <w:pPr>
+        <w:pStyle w:val="ImageCaption"/>
+      </w:pPr>
+      <w:r>
+        <w:rPr>
+          <w:bCs/>
+          <w:b/>
+        </w:rPr>
+        <w:t xml:space="preserve">Fig. 4</w:t>
+      </w:r>
+      <w:r>
+        <w:t xml:space="preserve"> </w:t>
+      </w:r>
+      <w:r>
+        <w:t xml:space="preserve">Fresh data sets, random forest. For each data set where exposure alone predicts a gap worse than −2 pp: the gap predicted from exposure only (circles), the gap predicted with label purity, Eq. (3) (diamonds), and the observed gap on new cases (bars). Shaded: within 2 pp of the target</w:t>
+      </w:r>
+    </w:p>
+    <w:bookmarkEnd w:id="42"/>
+    <w:bookmarkStart w:id="46" w:name="when-copies-are-not-exact"/>
     <w:p>
       <w:pPr>
         <w:pStyle w:val="Heading2"/>
@@ -6155,7 +6408,7 @@
         <w:pStyle w:val="BodyText"/>
       </w:pPr>
       <w:r>
-        <w:t xml:space="preserve">Even very small noise blinds the exact-match check: at every noise level above zero it recognized 0.0% of the copies (Fig. 4). The problem itself does not go away, though. With exact copies, the random forest’s coverage gap on truly new cases was −5.8 pp in classification. With noise of 0.1%, 1% and 10% of a standard deviation, it was −4.3, −3.6 and −2.7 pp (regression: −5.2, −4.1, −3.3 and −0.8 pp). Small amounts of noise leave most of the shortfall in place; only noise of 10% of a standard deviation removes most of it in regression. The exact-match fix cannot see these copies: once noise is added, its result is close to that of the standard method (−4.1 pp at the smallest noise level in classification).</w:t>
+        <w:t xml:space="preserve">Even very small noise blinds the exact-match check: at every noise level above zero it recognized none of the copies (0.0%; Fig. 5). The problem itself does not go away, though. With exact copies, the random forest’s coverage gap on truly new cases was −5.8 pp in classification. With noise of 0.1%, 1% and 10% of a standard deviation, it was −4.3, −3.6 and −2.7 pp (regression: −5.2, −4.1, −3.3 and −0.8 pp). Small amounts of noise leave most of the shortfall in place; only noise of 10% of a standard deviation removes most of it in regression. The exact-match fix cannot see these copies: once noise is added, its result is close to that of the standard method (−4.1 pp at the smallest noise level in classification).</w:t>
       </w:r>
     </w:p>
     <w:p>
@@ -6179,7 +6432,7 @@
         <w:t xml:space="preserve"> </w:t>
       </w:r>
       <w:r>
-        <w:t xml:space="preserve">to the nearest training rows does handle this case. We split calibration and test rows into six groups by that distance (exact copies form one group) and calibrated each group separately. Coverage of truly new cases then stayed at the target at every noise level (+0.5, +0.2, +0.1 and +0.5 pp in classification; +0.7 to +0.5 pp in regression), as good as an idealized version that knows the true record identity (−0.0 pp at 1% noise). In practice, then, the exact check is the right first step because it is simple and explains</w:t>
+        <w:t xml:space="preserve">to the nearest training rows does handle this case. We split calibration and test rows into six groups by that distance (exact copies form one group) and calibrated each group separately. Coverage of truly new cases then stayed at the target at every noise level (+0.5, +0.2, +0.1 and +0.5 pp in classification; +0.7 to +0.5 pp in regression), as good as an idealized version that knows the true record identity (0.0 pp at 1% noise). In practice, then, the exact check is the right first step because it is simple and explains</w:t>
       </w:r>
       <w:r>
         <w:t xml:space="preserve"> </w:t>
@@ -6207,18 +6460,18 @@
           <wp:inline>
             <wp:extent cx="5334000" cy="2203571"/>
             <wp:effectExtent b="0" l="0" r="0" t="0"/>
-            <wp:docPr descr="Fig. 4 Copies with added noise (random forest, median over 37 data sets; half of the rows copied). Coverage gap on truly new cases, in percentage points, for the standard method, the exact-match fix, the distance-based fix, and a reference that knows which records were copied" title="" id="41" name="Picture"/>
+            <wp:docPr descr="Fig. 5 Copies with added noise (random forest, median over 37 data sets; half of the rows copied). Coverage gap on truly new cases, in percentage points, for the standard method, the exact-match fix, the distance-based fix, and a reference that knows which records were copied" title="" id="44" name="Picture"/>
             <a:graphic>
               <a:graphicData uri="http://schemas.openxmlformats.org/drawingml/2006/picture">
                 <pic:pic>
                   <pic:nvPicPr>
-                    <pic:cNvPr descr="Fig_neardup.png" id="42" name="Picture"/>
+                    <pic:cNvPr descr="Fig_neardup.png" id="45" name="Picture"/>
                     <pic:cNvPicPr>
                       <a:picLocks noChangeArrowheads="1" noChangeAspect="1"/>
                     </pic:cNvPicPr>
                   </pic:nvPicPr>
                   <pic:blipFill>
-                    <a:blip r:embed="rId40"/>
+                    <a:blip r:embed="rId43"/>
                     <a:stretch>
                       <a:fillRect/>
                     </a:stretch>
@@ -6254,7 +6507,7 @@
           <w:bCs/>
           <w:b/>
         </w:rPr>
-        <w:t xml:space="preserve">Fig. 4</w:t>
+        <w:t xml:space="preserve">Fig. 5</w:t>
       </w:r>
       <w:r>
         <w:t xml:space="preserve"> </w:t>
@@ -6263,9 +6516,9 @@
         <w:t xml:space="preserve">Copies with added noise (random forest, median over 37 data sets; half of the rows copied). Coverage gap on truly new cases, in percentage points, for the standard method, the exact-match fix, the distance-based fix, and a reference that knows which records were copied</w:t>
       </w:r>
     </w:p>
-    <w:bookmarkEnd w:id="43"/>
-    <w:bookmarkEnd w:id="44"/>
-    <w:bookmarkStart w:id="48" w:name="discussion"/>
+    <w:bookmarkEnd w:id="46"/>
+    <w:bookmarkEnd w:id="47"/>
+    <w:bookmarkStart w:id="51" w:name="discussion"/>
     <w:p>
       <w:pPr>
         <w:pStyle w:val="Heading1"/>
@@ -6283,7 +6536,7 @@
         <w:t xml:space="preserve">Discussion</w:t>
       </w:r>
     </w:p>
-    <w:bookmarkStart w:id="45" w:name="what-a-practitioner-should-do"/>
+    <w:bookmarkStart w:id="48" w:name="what-a-practitioner-should-do"/>
     <w:p>
       <w:pPr>
         <w:pStyle w:val="Heading2"/>
@@ -6450,8 +6703,8 @@
         <w:t xml:space="preserve">The routine matters most where a model will meet records it has never seen: a new software module, a new network connection, a new website. In these settings the reported coverage is used to make decisions, such as how many modules to send to manual review or which alerts to escalate. An empty prediction set for a new defect-prone module, as we saw on mc1, is a silent failure that no overall coverage figure reveals.</w:t>
       </w:r>
     </w:p>
-    <w:bookmarkEnd w:id="45"/>
-    <w:bookmarkStart w:id="46" w:name="should-one-simply-remove-duplicates"/>
+    <w:bookmarkEnd w:id="48"/>
+    <w:bookmarkStart w:id="49" w:name="should-one-simply-remove-duplicates"/>
     <w:p>
       <w:pPr>
         <w:pStyle w:val="Heading2"/>
@@ -6477,8 +6730,8 @@
         <w:t xml:space="preserve">A common first reaction is to delete repeated rows before analysis. That is not always right. If the same input really does recur in deployment, for example a frequent network connection pattern, then repeats are part of the population, and deleting them changes the question being answered. Deleting repeats with conflicting labels also throws away information about label noise. Separate calibration avoids the choice: it keeps the data as they are and gives a valid promise for seen and for new cases, so the user can weight the two according to what is expected in deployment.</w:t>
       </w:r>
     </w:p>
-    <w:bookmarkEnd w:id="46"/>
-    <w:bookmarkStart w:id="47" w:name="limitations"/>
+    <w:bookmarkEnd w:id="49"/>
+    <w:bookmarkStart w:id="50" w:name="limitations"/>
     <w:p>
       <w:pPr>
         <w:pStyle w:val="Heading2"/>
@@ -6511,7 +6764,7 @@
         <w:t xml:space="preserve"> </w:t>
       </w:r>
       <w:r>
-        <w:t xml:space="preserve">The check detects only rows with identical feature values. Near-copies, such as the same record with a rounding difference or a re-measured value, are invisible to it. In our perturbation experiment, the exact-match check found none of the perturbed copies, and the remaining shortfall then had to be handled by distance-based calibration (Section 7). In practice the hashing can be made coarser (for example, by rounding features), but choosing that resolution is a modelling decision.</w:t>
+        <w:t xml:space="preserve">The check detects only rows with identical feature values. Near-copies, such as the same record with a rounding difference or a re-measured value, are invisible to it. In our perturbation experiment, the exact-match check found none of the perturbed copies, and the remaining shortfall then had to be handled by distance-based calibration (Section 7.2). In practice the hashing can be made coarser (for example, by rounding features), but choosing that resolution is a modelling decision.</w:t>
       </w:r>
     </w:p>
     <w:p>
@@ -6552,7 +6805,7 @@
         </m:sSup>
       </m:oMath>
       <w:r>
-        <w:t xml:space="preserve">.</w:t>
+        <w:t xml:space="preserve">. On fresh data, the predicted gap worked as a limit and as a screen for which data sets need the fix, but it did not rank data sets by the size of their shortfall (Section 7.1). It should be read as a warning level, not as a forecast of the exact coverage.</w:t>
       </w:r>
     </w:p>
     <w:p>
@@ -6627,9 +6880,9 @@
         <w:t xml:space="preserve">The study, including its code and much of its text, was produced with substantial help from an AI system under human direction (see Declarations). Every number in the paper is computed by released code from archived result files. The fresh validation analysis was fixed in a time-stamped commit before its data were collected, and deviations from that plan are recorded in the repository.</w:t>
       </w:r>
     </w:p>
-    <w:bookmarkEnd w:id="47"/>
-    <w:bookmarkEnd w:id="48"/>
-    <w:bookmarkStart w:id="49" w:name="conclusion"/>
+    <w:bookmarkEnd w:id="50"/>
+    <w:bookmarkEnd w:id="51"/>
+    <w:bookmarkStart w:id="52" w:name="conclusion"/>
     <w:p>
       <w:pPr>
         <w:pStyle w:val="Heading1"/>
@@ -6652,11 +6905,11 @@
         <w:pStyle w:val="FirstParagraph"/>
       </w:pPr>
       <w:r>
-        <w:t xml:space="preserve">Conformal prediction promises that its sets contain the right answer a stated share of the time, and practitioners check that promise on a random test split. When the data contain repeated rows, this check mixes cases the model has already seen with genuinely new ones, and it can report 90% while new cases are covered far less often. We showed how to predict the size of this problem from the data alone, before any model is trained, and how to remove it by calibrating seen and new cases separately. On software-defect, intrusion and phishing data the fix brought coverage of new cases back to the target. On most standard benchmarks the check correctly reported that nothing needed to change. The procedure takes seconds, adds two lines to an evaluation report, and turns a hidden failure into a visible and repairable one. Extending the check from exact to near-identical records is the most useful next step.</w:t>
-      </w:r>
-    </w:p>
-    <w:bookmarkEnd w:id="49"/>
-    <w:bookmarkStart w:id="50" w:name="appendix-a-derivations"/>
+        <w:t xml:space="preserve">Conformal prediction promises that its sets contain the right answer a stated share of the time, and practitioners check that promise on a random test split. When the data contain repeated rows, this check mixes cases the model has already seen with genuinely new ones, and it can report 90% while new cases are covered far less often. We showed how to predict the size of this problem from the data alone, before any model is trained, and how to remove it by calibrating seen and new cases separately. On software-defect, intrusion and phishing data, and on fresh data sets analysed under a plan fixed in advance, the fix brought coverage of new cases back to about the target. On most standard benchmarks the check correctly reported that nothing needed to change. The procedure takes seconds, adds two lines to an evaluation report, and turns a hidden failure into a visible and repairable one. Extending the check from exact to near-identical records is the most useful next step.</w:t>
+      </w:r>
+    </w:p>
+    <w:bookmarkEnd w:id="52"/>
+    <w:bookmarkStart w:id="53" w:name="appendix-a-derivations"/>
     <w:p>
       <w:pPr>
         <w:pStyle w:val="Heading1"/>
@@ -8954,8 +9207,8 @@
         <w:t xml:space="preserve">.</w:t>
       </w:r>
     </w:p>
-    <w:bookmarkEnd w:id="50"/>
-    <w:bookmarkStart w:id="51" w:name="statements-and-declarations"/>
+    <w:bookmarkEnd w:id="53"/>
+    <w:bookmarkStart w:id="54" w:name="statements-and-declarations"/>
     <w:p>
       <w:pPr>
         <w:pStyle w:val="Heading1"/>
@@ -9090,8 +9343,8 @@
         <w:t xml:space="preserve">The study design, literature search, code, experiments, statistical analysis and drafting of this manuscript were carried out with substantial assistance from an AI system (a large language model working with code-execution tools), under the direction of the human author(s). The text was revised for readability with the same assistance. All numerical results were produced by executed code whose outputs are archived with the repository. The human author(s) checked the work and take full responsibility for its content. [AUTHOR TO CONFIRM wording against the journal’s current AI policy.]</w:t>
       </w:r>
     </w:p>
-    <w:bookmarkEnd w:id="51"/>
-    <w:bookmarkStart w:id="52" w:name="references"/>
+    <w:bookmarkEnd w:id="54"/>
+    <w:bookmarkStart w:id="55" w:name="references"/>
     <w:p>
       <w:pPr>
         <w:pStyle w:val="Heading1"/>
@@ -9524,7 +9777,7 @@
         <w:t xml:space="preserve">Zhang R, Zhou P (2026) A Mondrian conformal predictive system with improved decision trees for uncertainty quantification under heteroscedasticity. Pattern Recognit 172:112338. https://doi.org/10.1016/j.patcog.2025.112338</w:t>
       </w:r>
     </w:p>
-    <w:bookmarkEnd w:id="52"/>
+    <w:bookmarkEnd w:id="55"/>
     <w:sectPr/>
   </w:body>
 </w:document>

</xml_diff>

<commit_message>
v2: second-review fixes (kc2 miss reported, overclaims removed, wording), all references cited, v2 supplement
Co-Authored-By: Claude Opus 5.5 <noreply@anthropic.com>
Claude-Session: https://claude.ai/code/session_011swGQJjskr3eenk5bukhrn
</commit_message>
<xml_diff>
--- a/manuscript/Revised_Manuscript.docx
+++ b/manuscript/Revised_Manuscript.docx
@@ -320,7 +320,7 @@
         <w:pStyle w:val="FirstParagraph"/>
       </w:pPr>
       <w:r>
-        <w:t xml:space="preserve">We evaluate the procedure in three ways. First, on three real application areas: software-defect prediction, network-intrusion detection and phishing detection. Second, on 103 standard benchmark data sets together with controlled experiments in which we add exact or slightly perturbed copies to clean data. Third, on a fresh collection of data sets that we selected and analysed only after the procedure was fixed. The overall picture is reassuring for most benchmark data: the problem is small where the check says it is small. Where the check raises a flag, the shortfall is real and often large, and the fix removes it. All code and results are openly available.</w:t>
+        <w:t xml:space="preserve">We evaluate the procedure in three ways. First, on three real application areas: software-defect prediction, network-intrusion detection and phishing detection. Second, on 103 standard benchmark data sets together with controlled experiments in which we add exact or slightly perturbed copies to clean data. Third, on a fresh collection of data sets that we selected and analysed only after the procedure was fixed. The overall picture is reassuring for most benchmark data: the problem is small where the check says it is small. Where the check raises a flag, the shortfall is often real and sometimes large, and the fix removes it; where the flag turns out to be a false alarm, the fix costs almost nothing. All code and results are openly available.</w:t>
       </w:r>
     </w:p>
     <w:bookmarkEnd w:id="20"/>
@@ -357,7 +357,7 @@
         <w:t xml:space="preserve"> </w:t>
       </w:r>
       <w:r>
-        <w:t xml:space="preserve">Split conformal prediction turns any fitted model into prediction sets or intervals with a coverage guarantee that holds in finite samples, provided calibration and test data are exchangeable (Papadopoulos et al. 2002; Lei et al. 2018; Vovk et al. 2022). We use the standard nonconformity scores:</w:t>
+        <w:t xml:space="preserve">Split conformal prediction turns any fitted model into prediction sets or intervals with a coverage guarantee that holds in finite samples, provided calibration and test data are exchangeable (Papadopoulos et al. 2002; Lei et al. 2018; Vovk et al. 2022). It is increasingly used in applied work, for example in drug discovery and toxicology (Norinder et al. 2014; Morger et al. 2021; Hernandez-Hernandez et al. 2026). We use the standard nonconformity scores:</w:t>
       </w:r>
       <w:r>
         <w:t xml:space="preserve"> </w:t>
@@ -409,7 +409,7 @@
         <w:t xml:space="preserve">marginal</w:t>
       </w:r>
       <w:r>
-        <w:t xml:space="preserve">, meaning it is averaged over all test cases. Coverage for every individual input cannot be guaranteed without further assumptions (Vovk 2012; Foygel Barber et al. 2021). Coverage within a fixed set of groups can be achieved, either by calibrating each group separately (Mondrian conformal prediction; Vovk et al. 2022) or by more general conditional calibration (Gibbs et al. 2025; Bastani et al. 2022). Group-wise calibration has been used for protected groups (Romano et al. 2020b), classes (Löfström et al. 2015; Ding et al. 2023), difficulty bins (Boström and Johansson 2020) and, recently, spatial regions (Seo et al. 2026) and demographic strata in clinical screening (Tareaf et al. 2026). Training-conditional guarantees, which hold with high probability over the calibration draw, go back to Vovk (2012). Our fix uses these standard tools. What is new is</w:t>
+        <w:t xml:space="preserve">, meaning it is averaged over all test cases. Coverage for every individual input cannot be guaranteed without further assumptions (Vovk 2012; Foygel Barber et al. 2021). Coverage within a fixed set of groups can be achieved, either by calibrating each group separately (Mondrian conformal prediction; Vovk et al. 2022) or by more general and localized conditional calibration (Guan 2023; Gibbs et al. 2025; Bastani et al. 2022). Group-wise calibration has been used for protected groups (Romano et al. 2020b), classes (Löfström et al. 2015; Ding et al. 2023), difficulty bins (Boström and Johansson 2020), two-level group structures (Dunn et al. 2023), predictive distributions (Zhang and Zhou 2026) and, recently, spatial regions (Seo et al. 2026) and demographic strata in clinical screening (Tareaf et al. 2026). Training-conditional guarantees, which hold with high probability over the calibration draw, go back to Vovk (2012). Our fix uses these standard tools. What is new is</w:t>
       </w:r>
       <w:r>
         <w:t xml:space="preserve"> </w:t>
@@ -2081,7 +2081,10 @@
         <w:t xml:space="preserve">predicted shortfall</w:t>
       </w:r>
       <w:r>
-        <w:t xml:space="preserve">. It is a worst case for models that memorize their training rows; less flexible models should fall short by less. It can fail when repeated rows disagree on the label but are still easy to predict, for example when their regression targets differ only slightly. We test both points below. A short derivation of Eqs. (1)–(3) and a simulation check are given in Appendix A.</w:t>
+        <w:t xml:space="preserve"> </w:t>
+      </w:r>
+      <w:r>
+        <w:t xml:space="preserve">(or predicted gap). It is a worst case for models that memorize their training rows; less flexible models should fall short by less. It can fail when repeated rows disagree on the label but are still easy to predict, for example when their regression targets differ only slightly. We test both points below. A short derivation of Eqs. (1)–(3) and a simulation check are given in Appendix A.</w:t>
       </w:r>
     </w:p>
     <w:bookmarkEnd w:id="24"/>
@@ -2383,7 +2386,7 @@
         <w:t xml:space="preserve"> </w:t>
       </w:r>
       <w:r>
-        <w:t xml:space="preserve">To show that repetition itself causes the shortfall, we took the 37 benchmark sets without any repeated rows and appended copies of a random 10%, 25%, 50% or 100% of their rows. To see what happens when repeats are not exact, we repeated this with 50% copies whose numeric features were perturbed by small random noise (0.1%, 1% or 10% of each feature’s standard deviation). In the perturbed setting the exact-match check cannot see the copies, so we measured coverage on rows whose</w:t>
+        <w:t xml:space="preserve">To show that repetition itself causes the shortfall, we took the 37 benchmark sets that have no repeated rows and at least 1,000 rows, and appended copies of a random 10%, 25%, 50% or 100% of their rows. To see what happens when repeats are not exact, we repeated this with 50% copies whose numeric features were perturbed by small random noise (0.1%, 1% or 10% of each feature’s standard deviation). In the perturbed setting the exact-match check cannot see the copies, so we measured coverage on rows whose</w:t>
       </w:r>
       <w:r>
         <w:t xml:space="preserve"> </w:t>
@@ -2417,7 +2420,7 @@
         <w:t xml:space="preserve"> </w:t>
       </w:r>
       <w:r>
-        <w:t xml:space="preserve">The predicted-shortfall formula (3) was derived after we had seen the benchmark results. To test it fairly, we fixed the analysis plan in a time-stamped version-control commit and then collected new data sets from OpenML collections we had not used: the AutoML Benchmark (Gijsbers et al. 2024) and the tabular benchmark of Grinsztajn et al. (2022). Data sets were included if the check, which uses no labels and no models, predicted at least 1% seen test rows. We used 20 random splits per data set.</w:t>
+        <w:t xml:space="preserve">The predicted-shortfall formula (3) was derived after we had seen the benchmark results. To test it fairly, we fixed the analysis plan in a time-stamped version-control commit and then collected new data sets from OpenML collections we had not used: the AutoML Benchmark (Gijsbers et al. 2024) and the tabular benchmark of Grinsztajn et al. (2022). Data sets were included if the check, which uses no labels and no models, predicted at least 1% seen test rows. Data sets with more than 30,000 rows were reduced as above, except that a uniform row sample was used when a single group of identical rows exceeded 6,000 rows (a rule also fixed in advance). We used 20 random splits per data set.</w:t>
       </w:r>
     </w:p>
     <w:p>
@@ -2435,7 +2438,7 @@
         <w:t xml:space="preserve"> </w:t>
       </w:r>
       <w:r>
-        <w:t xml:space="preserve">Five common learners were trained with fixed default settings: logistic or ridge regression, random forest (200 trees; Breiman 2001), LightGBM (300 trees; Ke et al. 2017), 5-nearest neighbours and a small neural network. The fresh validation set used the first three. All preprocessing was fitted on training rows only. The target coverage was 90% (</w:t>
+        <w:t xml:space="preserve">Five common learners were trained with fixed default settings: logistic or ridge regression, random forest (200 trees; Breiman 2001), LightGBM (300 trees; Ke et al. 2017), 5-nearest neighbours and a small neural network. The fresh validation set used the first three. Models were implemented with scikit-learn (Pedregosa et al. 2011) and LightGBM, and all data were obtained from OpenML (Vanschoren et al. 2014). All preprocessing was fitted on training rows only. The target coverage was 90% (</w:t>
       </w:r>
       <m:oMath>
         <m:r>
@@ -2546,7 +2549,7 @@
         <w:t xml:space="preserve"> </w:t>
       </w:r>
       <w:r>
-        <w:t xml:space="preserve">columns need only the data. The other columns come from 10 random splits.</w:t>
+        <w:t xml:space="preserve">columns need only the data. The other columns come from 10 random splits. Results for the linear model are in the Supplementary Material (Table R1).</w:t>
       </w:r>
     </w:p>
     <w:p>
@@ -2558,7 +2561,7 @@
           <wp:inline>
             <wp:extent cx="3379304" cy="2966448"/>
             <wp:effectExtent b="0" l="0" r="0" t="0"/>
-            <wp:docPr descr="Fig. 1 Coverage of 90% prediction sets in the three applications (random forest, mean of 10 random splits). Bars: overall coverage as reported by the usual check; circles: coverage on new cases with standard calibration; diamonds: coverage on new cases after the fix (separate calibration). Vertical line: the promised 90%" title="" id="29" name="Picture"/>
+            <wp:docPr descr="Fig. 1 Coverage of 90% prediction sets in the three applications (random forest, mean of 10 random splits). Ticks: overall coverage as reported by the usual check; circles: coverage on new cases with standard calibration; diamonds: coverage on new cases after the fix (separate calibration). Vertical line: the promised 90%" title="" id="29" name="Picture"/>
             <a:graphic>
               <a:graphicData uri="http://schemas.openxmlformats.org/drawingml/2006/picture">
                 <pic:pic>
@@ -2611,7 +2614,7 @@
         <w:t xml:space="preserve"> </w:t>
       </w:r>
       <w:r>
-        <w:t xml:space="preserve">Coverage of 90% prediction sets in the three applications (random forest, mean of 10 random splits). Bars: overall coverage as reported by the usual check; circles: coverage on new cases with standard calibration; diamonds: coverage on new cases after the fix (separate calibration). Vertical line: the promised 90%</w:t>
+        <w:t xml:space="preserve">Coverage of 90% prediction sets in the three applications (random forest, mean of 10 random splits). Ticks: overall coverage as reported by the usual check; circles: coverage on new cases with standard calibration; diamonds: coverage on new cases after the fix (separate calibration). Vertical line: the promised 90%</w:t>
       </w:r>
     </w:p>
     <w:p>
@@ -2689,7 +2692,7 @@
         <w:pStyle w:val="BodyText"/>
       </w:pPr>
       <w:r>
-        <w:t xml:space="preserve">The smaller defect sets show the other side. Where the check predicts a shortfall of 2 pp or less (pc1, pc3, pc4, jm1, mw1), the measured coverage on new modules stayed within about 2 pp of 90%. The fix changed little there, and the check correctly signalled that standard conformal prediction was adequate.</w:t>
+        <w:t xml:space="preserve">The smaller defect sets show the other side. The check predicts a gap of 2 pp or less for six of them. In five (pc1, pc3, pc4, jm1, mw1), coverage on new modules stayed within about 2 pp of 90% (88.1–89.6%), the fix changed little, and the check correctly signalled that standard conformal prediction was adequate. The sixth, kc2 (522 modules), is a miss: the predicted gap was only −1.4 pp, but new modules were covered at 86.7% (89.6% after the fix). Its exposure, however, is high (30% of test modules are seen), which is why we recommend reading exposure alongside the predicted gap (Section 8.1).</w:t>
       </w:r>
     </w:p>
     <w:p>
@@ -5594,7 +5597,7 @@
         <w:pStyle w:val="FirstParagraph"/>
       </w:pPr>
       <w:r>
-        <w:t xml:space="preserve">Repeated rows are everywhere in the benchmarks. Of the 103 data sets, 53 contain at least one repeated feature vector, and in 11 at least 30% of rows belong to a group of identical rows. The exposure formula (2) predicted the share of seen test rows almost exactly (mean absolute error 0.0012, correlation 0.9998 with the share observed over 10 random splits), so this part of the check can be trusted.</w:t>
+        <w:t xml:space="preserve">Repeated rows are everywhere in the benchmarks. Of the 103 data sets, 53 contain at least one repeated feature vector, and in 11 at least 30% of rows belong to a group of identical rows. The exposure formula (2) predicted the share of seen test rows almost exactly (mean absolute error 0.0012, correlation 0.9998 with the share observed over 10 random splits), so this part of the check can be trusted. Per-data-set statistics are in the Supplementary Material (Table S1).</w:t>
       </w:r>
     </w:p>
     <w:p>
@@ -5664,7 +5667,7 @@
         <w:t xml:space="preserve"> </w:t>
       </w:r>
       <w:r>
-        <w:t xml:space="preserve">(about 85% seen test rows) new cases were covered at only 0.73–0.79. In</w:t>
+        <w:t xml:space="preserve">(about 85% seen test rows) new cases were covered only 73–79% of the time, depending on the learner. In</w:t>
       </w:r>
       <w:r>
         <w:t xml:space="preserve"> </w:t>
@@ -5677,7 +5680,7 @@
         <w:t xml:space="preserve">cps88wages</w:t>
       </w:r>
       <w:r>
-        <w:t xml:space="preserve">, with the same exposure, identical worker profiles almost always have different wages, so there is nothing to memorize, and new cases were covered at the nominal rate (0.89–0.91). Across the 41 data sets with repeats, the predicted shortfall</w:t>
+        <w:t xml:space="preserve">, with the same exposure, identical worker profiles almost always have different wages, so there is nothing to memorize, and new cases were covered at the nominal rate (89–91%). Across the 41 data sets with repeats, the predicted shortfall</w:t>
       </w:r>
       <w:r>
         <w:t xml:space="preserve"> </w:t>
@@ -5767,7 +5770,7 @@
         <w:t xml:space="preserve"> </w:t>
       </w:r>
       <w:r>
-        <w:t xml:space="preserve">itself, where the shortfall (about 16 pp for the random forest) is far larger than predicted (0.84 was the typical ratio; here</w:t>
+        <w:t xml:space="preserve">itself, where the random forest fell about 16 pp short although</w:t>
       </w:r>
       <w:r>
         <w:t xml:space="preserve"> </w:t>
@@ -5793,7 +5796,7 @@
         <w:t xml:space="preserve"> </w:t>
       </w:r>
       <w:r>
-        <w:t xml:space="preserve">is only about −4 pp). Its repeated rows disagree on the exact target value, so they do not count as</w:t>
+        <w:t xml:space="preserve">is only about −4 pp. Its repeated rows disagree on the exact target value, so they do not count as</w:t>
       </w:r>
       <w:r>
         <w:t xml:space="preserve"> </w:t>
@@ -6004,7 +6007,7 @@
         <w:pStyle w:val="FirstParagraph"/>
       </w:pPr>
       <w:r>
-        <w:t xml:space="preserve">Separate calibration restored coverage on new cases across the board. On the benchmark data with repeats, its median gap was between −0.1 to +0.3 pp, and the confidence interval of the median stayed above −1 pp in all learner–score combinations. Its worst single data set was again solar_flare (−5.8 pp, against −16.9 pp for the standard method). That data set leaves only about 36 new calibration rows per split, and in 200 extra splits separate calibration averaged 90.9% (95% CI 89.9–91.8%) for LightGBM while the standard method averaged 78%.</w:t>
+        <w:t xml:space="preserve">Separate calibration restored coverage on new cases across the board. On the benchmark data with repeats, its median gap ranged from −0.1 to +0.3 pp, and the confidence interval of the median stayed above −1 pp in all learner–score combinations. Its worst single data set was again solar_flare (−5.8 pp, against −16.9 pp for the standard method). That data set leaves only about 36 new calibration rows per split, and in 200 extra splits separate calibration averaged 90.9% (95% CI 89.9–91.8%) for LightGBM while the standard method averaged 78%.</w:t>
       </w:r>
     </w:p>
     <w:p>
@@ -6043,7 +6046,7 @@
         <w:t xml:space="preserve">”</w:t>
       </w:r>
       <w:r>
-        <w:t xml:space="preserve">) also gives honest coverage for new cases (median 0.898–0.905). It changes the training data, though, and it answers only the question</w:t>
+        <w:t xml:space="preserve">) also gives honest coverage for new cases (median 89.8–90.5%). It changes the training data, though, and it answers only the question</w:t>
       </w:r>
       <w:r>
         <w:t xml:space="preserve"> </w:t>
@@ -6104,7 +6107,7 @@
         <w:pStyle w:val="FirstParagraph"/>
       </w:pPr>
       <w:r>
-        <w:t xml:space="preserve">The predicted-gap formula (3) was derived after we had seen the benchmark results, so the analyses above could flatter it. We therefore fixed the analysis plan in a time-stamped commit and then selected new data sets from two collections we had not used: the AutoML Benchmark (Gijsbers et al. 2024) and the tabular benchmark of Grinsztajn et al. (2022). The selection used no labels and no models. It kept data sets in which at least 1% of test rows are expected to be seen, and it dropped data sets we had already used, data sets that appear twice in these collections, and five whose download failed. This left 20 data sets (8 classification, 12 regression), each analysed with 20 random splits. The plan named five tests in advance. We report all of them, including the two that failed.</w:t>
+        <w:t xml:space="preserve">The predicted-gap formula (3) was derived after we had seen the benchmark results, so the analyses above could flatter it. We therefore fixed the analysis plan in a time-stamped commit and then selected new data sets from two collections we had not used: the AutoML Benchmark (Gijsbers et al. 2024) and the tabular benchmark of Grinsztajn et al. (2022). The selection used no labels and no models. It kept data sets in which at least 1% of test rows are expected to be seen, and it dropped data sets we had already used, data sets that appear twice in these collections, and five whose download failed. This left 20 data sets (8 classification, 12 regression), each analysed with 20 random splits. The full selection log, with the reason for every exclusion, and per-data-set results are in the Supplementary Material (Tables R2–R7). The plan named five tests in advance. Two were clearly supported and three were not, and we report all five.</w:t>
       </w:r>
     </w:p>
     <w:p>
@@ -6122,7 +6125,7 @@
         <w:t xml:space="preserve"> </w:t>
       </w:r>
       <w:r>
-        <w:t xml:space="preserve">Separate calibration kept the coverage of new cases at the target for all three learners. The median gap was 0.0 pp for random forests (worst data set −0.7 pp), 0.0 pp for LightGBM (worst −0.9 pp) and 0.0 pp for the linear models (worst −0.5 pp). Without the fix, the worst data set fell −27.5 pp (random forest) and −33.3 pp (LightGBM) below target. The fix made new-case sets larger by a median factor of only 1.00, because on most of these data sets there was little to fix. In one data set (seattlecrime6) almost every test row is seen, and the fix returned the full set for new cases in 75.0% of splits, because too few new calibration rows existed to do anything else.</w:t>
+        <w:t xml:space="preserve">Separate calibration kept the coverage of new cases at the target for all three learners. The median gap was 0.0 pp for random forests (worst data set −0.7 pp), 0.0 pp for LightGBM (worst −0.9 pp) and 0.0 pp for the linear models (worst −0.5 pp). Without the fix, the worst data set’s gap was −27.5 pp (random forest) and −33.3 pp (LightGBM). The fix made new-case sets larger by a median factor of only 1.00, because on most of these data sets there was little to fix. In one data set (seattlecrime6) almost every test row is seen, and the fix returned the full set for new cases in 75.0% of splits, because too few new calibration rows existed to do anything else.</w:t>
       </w:r>
     </w:p>
     <w:p>
@@ -6284,7 +6287,7 @@
         <w:t xml:space="preserve">”</w:t>
       </w:r>
       <w:r>
-        <w:t xml:space="preserve">. Here the check did well (Fig. 4). Before these results existed, our draft guidance said that a data set with a predicted gap no worse than −2 pp and fewer than 10% seen test rows needs no fix (Section 8.1). Of the fresh data sets, 9 met this rule, and none of them fell short by more than −1.0 pp with any learner. In the other direction, label purity removed false alarms that exposure alone would raise. In black_friday (63% seen test rows), seattlecrime6 (100%) and superconduct (33%), repeated rows almost never agree on the exact target, so purity predicts no shortfall even though exposure alone predicts −17.1, −90.0 and −5.0 pp. The random forest’s actual gaps were +1.8, +6.7 and −0.9 pp. Of the 10 data sets that exposure alone flags, the purity-based check flags 6, and among these are all data sets where the random forest or LightGBM fell more than 2 pp short (3 and 4 data sets). The clearest case is analcatdata_supreme, where 81% of test rows have a training copy with exactly the same target. The check predicted a worst case of −42.4 pp, and new cases were covered −27.5 pp (random forest) and −33.3 pp (LightGBM) off target.</w:t>
+        <w:t xml:space="preserve">. Here the check did well (Fig. 4). Before these results existed, our draft guidance said that a data set with a predicted gap no worse than −2 pp and fewer than 10% seen test rows needs no fix (Section 8.1). Of the fresh data sets, 9 met this rule, and the worst gap among them, over all three learners, was −1.0 pp. In the other direction, label purity removed false alarms that exposure alone would raise. In black_friday (63% seen test rows), seattlecrime6 (100%) and superconduct (33%), repeated rows almost never agree on the exact target, so purity predicts no shortfall even though exposure alone predicts −17.1, −90.0 and −5.0 pp. The random forest’s actual gaps were +1.8, +6.7 and −0.9 pp. Of the 10 data sets that exposure alone flags, the purity-based check flags 6, and among these are all data sets where the random forest or LightGBM fell more than 2 pp short (3 and 4 data sets). The clearest case is analcatdata_supreme, where 81% of test rows have a training copy with exactly the same target. The check predicted a worst case of −42.4 pp, and the observed gaps on new cases were −27.5 pp (random forest) and −33.3 pp (LightGBM).</w:t>
       </w:r>
     </w:p>
     <w:p>
@@ -6292,7 +6295,7 @@
         <w:pStyle w:val="BodyText"/>
       </w:pPr>
       <w:r>
-        <w:t xml:space="preserve">The one miss was a linear model on black_friday, which fell −3.7 pp short although the purity-based check predicted no problem. A linear model cannot memorize rows, so this shortfall is not the memorization effect the check is built for; exposure alone did flag this data set. This again suggests reading both numbers, as recommended in Section 8.1.</w:t>
+        <w:t xml:space="preserve">The one miss was a linear model on black_friday, whose gap was −3.7 pp although the purity-based check predicted no problem. A linear model cannot memorize rows, so this shortfall is not the memorization effect the check is built for; exposure alone did flag this data set. This again suggests reading both numbers, as recommended in Section 8.1.</w:t>
       </w:r>
     </w:p>
     <w:p>
@@ -6304,7 +6307,7 @@
           <wp:inline>
             <wp:extent cx="3351780" cy="2623930"/>
             <wp:effectExtent b="0" l="0" r="0" t="0"/>
-            <wp:docPr descr="Fig. 4 Fresh data sets, random forest. For each data set where exposure alone predicts a gap worse than −2 pp: the gap predicted from exposure only (circles), the gap predicted with label purity, Eq. (3) (diamonds), and the observed gap on new cases (bars). Shaded: within 2 pp of the target" title="" id="40" name="Picture"/>
+            <wp:docPr descr="Fig. 4 Fresh data sets, random forest. For each data set where exposure alone predicts a gap worse than −2 pp: the gap predicted from exposure only (circles), the gap predicted with label purity, Eq. (3) (diamonds), and the observed gap on new cases (ticks). Shaded: within 2 pp of the target" title="" id="40" name="Picture"/>
             <a:graphic>
               <a:graphicData uri="http://schemas.openxmlformats.org/drawingml/2006/picture">
                 <pic:pic>
@@ -6357,7 +6360,7 @@
         <w:t xml:space="preserve"> </w:t>
       </w:r>
       <w:r>
-        <w:t xml:space="preserve">Fresh data sets, random forest. For each data set where exposure alone predicts a gap worse than −2 pp: the gap predicted from exposure only (circles), the gap predicted with label purity, Eq. (3) (diamonds), and the observed gap on new cases (bars). Shaded: within 2 pp of the target</w:t>
+        <w:t xml:space="preserve">Fresh data sets, random forest. For each data set where exposure alone predicts a gap worse than −2 pp: the gap predicted from exposure only (circles), the gap predicted with label purity, Eq. (3) (diamonds), and the observed gap on new cases (ticks). Shaded: within 2 pp of the target</w:t>
       </w:r>
     </w:p>
     <w:bookmarkEnd w:id="42"/>
@@ -6384,7 +6387,7 @@
         <w:pStyle w:val="FirstParagraph"/>
       </w:pPr>
       <w:r>
-        <w:t xml:space="preserve">Real duplicates are often not byte-identical: a value is rounded differently, or a record is re-measured. To see what this does, we appended copies of half of the rows to each of the 37 duplicate-free data sets and added a little noise to the copies’ numeric features, from none up to 10% of each feature’s standard deviation. Because we created the copies ourselves, we know which test rows are</w:t>
+        <w:t xml:space="preserve">Real duplicates are often not byte-identical: a value is rounded differently, or a record is re-measured. To see what this does, we appended copies of half of the rows to each of the same 37 duplicate-free data sets and added a little noise to the copies’ numeric features, from none up to 10% of each feature’s standard deviation. Because we created the copies ourselves, we know which test rows are</w:t>
       </w:r>
       <w:r>
         <w:t xml:space="preserve"> </w:t>
@@ -6432,7 +6435,7 @@
         <w:t xml:space="preserve"> </w:t>
       </w:r>
       <w:r>
-        <w:t xml:space="preserve">to the nearest training rows does handle this case. We split calibration and test rows into six groups by that distance (exact copies form one group) and calibrated each group separately. Coverage of truly new cases then stayed at the target at every noise level (+0.5, +0.2, +0.1 and +0.5 pp in classification; +0.7 to +0.5 pp in regression), as good as an idealized version that knows the true record identity (0.0 pp at 1% noise). In practice, then, the exact check is the right first step because it is simple and explains</w:t>
+        <w:t xml:space="preserve">to the nearest training rows does handle this case. We split calibration and test rows into six groups by that distance (exact copies form one group) and calibrated each group separately. Coverage of truly new cases then stayed at the target at every noise level (+0.5, +0.2, +0.1 and +0.5 pp in classification; +0.7, +0.2, +0.1 and +0.5 pp in regression), as good as an idealized version that knows the true record identity (0.0 pp at 1% noise). In practice, then, the exact check is the right first step because it is simple and explains</w:t>
       </w:r>
       <w:r>
         <w:t xml:space="preserve"> </w:t>
@@ -6727,7 +6730,7 @@
         <w:pStyle w:val="FirstParagraph"/>
       </w:pPr>
       <w:r>
-        <w:t xml:space="preserve">A common first reaction is to delete repeated rows before analysis. That is not always right. If the same input really does recur in deployment, for example a frequent network connection pattern, then repeats are part of the population, and deleting them changes the question being answered. Deleting repeats with conflicting labels also throws away information about label noise. Separate calibration avoids the choice: it keeps the data as they are and gives a valid promise for seen and for new cases, so the user can weight the two according to what is expected in deployment.</w:t>
+        <w:t xml:space="preserve">A common first reaction is to delete repeated rows before analysis. That is not always right. If the same input really does recur in deployment, for example a frequent network connection pattern, then repeats are part of the population, and deleting them changes the question being answered. Deleting repeats with conflicting labels also throws away information about label noise. Where records arrive over time, a time-based split (Sheridan 2013) is another honest evaluation, but it answers a different question again. Separate calibration avoids the choice: it keeps the data as they are and gives a valid promise for seen and for new cases, so the user can weight the two according to what is expected in deployment.</w:t>
       </w:r>
     </w:p>
     <w:bookmarkEnd w:id="49"/>
@@ -6841,7 +6844,7 @@
         <w:t xml:space="preserve"> </w:t>
       </w:r>
       <w:r>
-        <w:t xml:space="preserve">Coverage on held-out new rows equals coverage on genuinely new records only if future records come from the same population. If deployment brings a distribution shift, separate calibration does not help with that.</w:t>
+        <w:t xml:space="preserve">Coverage on held-out new rows equals coverage on genuinely new records only if future records come from the same population. If deployment brings a distribution shift, separate calibration does not help with that; weighted or shift-aware conformal methods are needed (Tibshirani et al. 2019; Barber et al. 2023).</w:t>
       </w:r>
     </w:p>
     <w:p>
@@ -9470,7 +9473,7 @@
         <w:pStyle w:val="BodyText"/>
       </w:pPr>
       <w:r>
-        <w:t xml:space="preserve">Friedman M (1937) The use of ranks to avoid the assumption of normality implicit in the analysis of variance. J Am Stat Assoc 32(200):675–701. https://doi.org/10.1080/01621459.1937.10503522</w:t>
+        <w:t xml:space="preserve">Gibbs I, Cherian JJ, Candès EJ (2025) Conformal prediction with conditional guarantees. J R Stat Soc Ser B Stat Methodol 87(4):1100–1126. https://doi.org/10.1093/jrsssb/qkaf008</w:t>
       </w:r>
     </w:p>
     <w:p>
@@ -9478,7 +9481,7 @@
         <w:pStyle w:val="BodyText"/>
       </w:pPr>
       <w:r>
-        <w:t xml:space="preserve">Gibbs I, Cherian JJ, Candès EJ (2025) Conformal prediction with conditional guarantees. J R Stat Soc Ser B Stat Methodol 87(4):1100–1126. https://doi.org/10.1093/jrsssb/qkaf008</w:t>
+        <w:t xml:space="preserve">Gijsbers P, Bueno MLP, Coors S, LeDell E, Poirier S, Thomas J, Bischl B, Vanschoren J (2024) AMLB: an AutoML benchmark. J Mach Learn Res 25(101):1–65</w:t>
       </w:r>
     </w:p>
     <w:p>
@@ -9486,7 +9489,7 @@
         <w:pStyle w:val="BodyText"/>
       </w:pPr>
       <w:r>
-        <w:t xml:space="preserve">Gijsbers P, Bueno MLP, Coors S, LeDell E, Poirier S, Thomas J, Bischl B, Vanschoren J (2024) AMLB: an AutoML benchmark. J Mach Learn Res 25(101):1–65</w:t>
+        <w:t xml:space="preserve">Gray D, Bowes D, Davey N, Sun Y, Christianson B (2011) The misuse of the NASA metrics data program data sets for automated software defect prediction. In: 15th Annual Conference on Evaluation &amp; Assessment in Software Engineering (EASE 2011), pp 96–103. https://doi.org/10.1049/ic.2011.0012</w:t>
       </w:r>
     </w:p>
     <w:p>
@@ -9494,7 +9497,7 @@
         <w:pStyle w:val="BodyText"/>
       </w:pPr>
       <w:r>
-        <w:t xml:space="preserve">Gray D, Bowes D, Davey N, Sun Y, Christianson B (2011) The misuse of the NASA metrics data program data sets for automated software defect prediction. In: 15th Annual Conference on Evaluation &amp; Assessment in Software Engineering (EASE 2011), pp 96–103. https://doi.org/10.1049/ic.2011.0012</w:t>
+        <w:t xml:space="preserve">Grinsztajn L, Oyallon E, Varoquaux G (2022) Why do tree-based models still outperform deep learning on typical tabular data? In: Advances in Neural Information Processing Systems 35 (Datasets and Benchmarks Track). https://doi.org/10.52202/068431-0037</w:t>
       </w:r>
     </w:p>
     <w:p>
@@ -9502,7 +9505,7 @@
         <w:pStyle w:val="BodyText"/>
       </w:pPr>
       <w:r>
-        <w:t xml:space="preserve">Grinsztajn L, Oyallon E, Varoquaux G (2022) Why do tree-based models still outperform deep learning on typical tabular data? In: Advances in Neural Information Processing Systems 35 (Datasets and Benchmarks Track). https://doi.org/10.52202/068431-0037</w:t>
+        <w:t xml:space="preserve">Guan L (2023) Localized conformal prediction: a generalized inference framework for conformal prediction. Biometrika 110(1):33–50. https://doi.org/10.1093/biomet/asac040</w:t>
       </w:r>
     </w:p>
     <w:p>
@@ -9510,7 +9513,7 @@
         <w:pStyle w:val="BodyText"/>
       </w:pPr>
       <w:r>
-        <w:t xml:space="preserve">Guan L (2023) Localized conformal prediction: a generalized inference framework for conformal prediction. Biometrika 110(1):33–50. https://doi.org/10.1093/biomet/asac040</w:t>
+        <w:t xml:space="preserve">Hernandez-Hernandez S, Guo Q, Ballester PJ (2026) Conformal prediction of molecule-induced cancer cell growth inhibition challenged by strong distribution shifts. Pattern Recognit 172:112501. https://doi.org/10.1016/j.patcog.2025.112501</w:t>
       </w:r>
     </w:p>
     <w:p>
@@ -9518,7 +9521,7 @@
         <w:pStyle w:val="BodyText"/>
       </w:pPr>
       <w:r>
-        <w:t xml:space="preserve">Guo C, Pleiss G, Sun Y, Weinberger KQ (2017) On calibration of modern neural networks. In: Proceedings of the 34th International Conference on Machine Learning, PMLR 70:1321–1330</w:t>
+        <w:t xml:space="preserve">Holm S (1979) A simple sequentially rejective multiple test procedure. Scand J Stat 6(2):65–70</w:t>
       </w:r>
     </w:p>
     <w:p>
@@ -9526,7 +9529,7 @@
         <w:pStyle w:val="BodyText"/>
       </w:pPr>
       <w:r>
-        <w:t xml:space="preserve">Hernandez-Hernandez S, Guo Q, Ballester PJ (2026) Conformal prediction of molecule-induced cancer cell growth inhibition challenged by strong distribution shifts. Pattern Recognit 172:112501. https://doi.org/10.1016/j.patcog.2025.112501</w:t>
+        <w:t xml:space="preserve">Kapoor S, Narayanan A (2023) Leakage and the reproducibility crisis in machine-learning-based science. Patterns 4(9):100804. https://doi.org/10.1016/j.patter.2023.100804</w:t>
       </w:r>
     </w:p>
     <w:p>
@@ -9534,7 +9537,7 @@
         <w:pStyle w:val="BodyText"/>
       </w:pPr>
       <w:r>
-        <w:t xml:space="preserve">Holm S (1979) A simple sequentially rejective multiple test procedure. Scand J Stat 6(2):65–70</w:t>
+        <w:t xml:space="preserve">Kaufman S, Rosset S, Perlich C, Stitelman O (2012) Leakage in data mining. ACM Trans Knowl Discov Data 6(4):1–21. https://doi.org/10.1145/2382577.2382579</w:t>
       </w:r>
     </w:p>
     <w:p>
@@ -9542,7 +9545,7 @@
         <w:pStyle w:val="BodyText"/>
       </w:pPr>
       <w:r>
-        <w:t xml:space="preserve">Kapoor S, Narayanan A (2023) Leakage and the reproducibility crisis in machine-learning-based science. Patterns 4(9):100804. https://doi.org/10.1016/j.patter.2023.100804</w:t>
+        <w:t xml:space="preserve">Ke G, Meng Q, Finley T, Wang T, Chen W, Ma W, Ye Q, Liu TY (2017) LightGBM: a highly efficient gradient boosting decision tree. In: Advances in Neural Information Processing Systems 30, pp 3146–3154</w:t>
       </w:r>
     </w:p>
     <w:p>
@@ -9550,7 +9553,7 @@
         <w:pStyle w:val="BodyText"/>
       </w:pPr>
       <w:r>
-        <w:t xml:space="preserve">Kaufman S, Rosset S, Perlich C, Stitelman O (2012) Leakage in data mining. ACM Trans Knowl Discov Data 6(4):1–21. https://doi.org/10.1145/2382577.2382579</w:t>
+        <w:t xml:space="preserve">Lee K, Ippolito D, Nystrom A, Zhang C, Eck D, Callison-Burch C, Carlini N (2022) Deduplicating training data makes language models better. In: Proceedings of the 60th Annual Meeting of the Association for Computational Linguistics, pp 8424–8445. https://doi.org/10.18653/v1/2022.acl-long.577</w:t>
       </w:r>
     </w:p>
     <w:p>
@@ -9558,7 +9561,7 @@
         <w:pStyle w:val="BodyText"/>
       </w:pPr>
       <w:r>
-        <w:t xml:space="preserve">Ke G, Meng Q, Finley T, Wang T, Chen W, Ma W, Ye Q, Liu TY (2017) LightGBM: a highly efficient gradient boosting decision tree. In: Advances in Neural Information Processing Systems 30, pp 3146–3154</w:t>
+        <w:t xml:space="preserve">Lei J, G’Sell M, Rinaldo A, Tibshirani RJ, Wasserman L (2018) Distribution-free predictive inference for regression. J Am Stat Assoc 113(523):1094–1111. https://doi.org/10.1080/01621459.2017.1307116</w:t>
       </w:r>
     </w:p>
     <w:p>
@@ -9566,7 +9569,7 @@
         <w:pStyle w:val="BodyText"/>
       </w:pPr>
       <w:r>
-        <w:t xml:space="preserve">Lee K, Ippolito D, Nystrom A, Zhang C, Eck D, Callison-Burch C, Carlini N (2022) Deduplicating training data makes language models better. In: Proceedings of the 60th Annual Meeting of the Association for Computational Linguistics, pp 8424–8445. https://doi.org/10.18653/v1/2022.acl-long.577</w:t>
+        <w:t xml:space="preserve">Lewis P, Stenetorp P, Riedel S (2021) Question and answer test-train overlap in open-domain question answering datasets. In: Proceedings of the 16th Conference of the European Chapter of the Association for Computational Linguistics, pp 1000–1008. https://doi.org/10.18653/v1/2021.eacl-main.86</w:t>
       </w:r>
     </w:p>
     <w:p>
@@ -9574,7 +9577,7 @@
         <w:pStyle w:val="BodyText"/>
       </w:pPr>
       <w:r>
-        <w:t xml:space="preserve">Lei J, G’Sell M, Rinaldo A, Tibshirani RJ, Wasserman L (2018) Distribution-free predictive inference for regression. J Am Stat Assoc 113(523):1094–1111. https://doi.org/10.1080/01621459.2017.1307116</w:t>
+        <w:t xml:space="preserve">Li H (2026) Rows are not samples: duplicate records, evaluation bias, and ranking distortion in standard tabular benchmarks. Zenodo (preprint, not peer reviewed). https://doi.org/10.5281/zenodo.23119065</w:t>
       </w:r>
     </w:p>
     <w:p>
@@ -9582,7 +9585,7 @@
         <w:pStyle w:val="BodyText"/>
       </w:pPr>
       <w:r>
-        <w:t xml:space="preserve">Lewis P, Stenetorp P, Riedel S (2021) Question and answer test-train overlap in open-domain question answering datasets. In: Proceedings of the 16th Conference of the European Chapter of the Association for Computational Linguistics, pp 1000–1008. https://doi.org/10.18653/v1/2021.eacl-main.86</w:t>
+        <w:t xml:space="preserve">Löfström T, Boström H, Linusson H, Johansson U (2015) Bias reduction through conditional conformal prediction. Intell Data Anal 19(6):1355–1375. https://doi.org/10.3233/IDA-150786</w:t>
       </w:r>
     </w:p>
     <w:p>
@@ -9590,31 +9593,7 @@
         <w:pStyle w:val="BodyText"/>
       </w:pPr>
       <w:r>
-        <w:t xml:space="preserve">Li H (2026) Rows are not samples: duplicate records, evaluation bias, and ranking distortion in standard tabular benchmarks. Zenodo (preprint, not peer reviewed). https://doi.org/10.5281/zenodo.23119065</w:t>
-      </w:r>
-    </w:p>
-    <w:p>
-      <w:pPr>
-        <w:pStyle w:val="BodyText"/>
-      </w:pPr>
-      <w:r>
-        <w:t xml:space="preserve">Löfström T, Boström H, Linusson H, Johansson U (2015) Bias reduction through conditional conformal prediction. Intell Data Anal 19(6):1355–1375. https://doi.org/10.3233/IDA-150786</w:t>
-      </w:r>
-    </w:p>
-    <w:p>
-      <w:pPr>
-        <w:pStyle w:val="BodyText"/>
-      </w:pPr>
-      <w:r>
         <w:t xml:space="preserve">Morger A, Svensson F, Arvidsson McShane S, Gauraha N, Norinder U, Spjuth O, Volkamer A (2021) Assessing the calibration in toxicological in vitro models with conformal prediction. J Cheminform 13:35. https://doi.org/10.1186/s13321-021-00511-5</w:t>
-      </w:r>
-    </w:p>
-    <w:p>
-      <w:pPr>
-        <w:pStyle w:val="BodyText"/>
-      </w:pPr>
-      <w:r>
-        <w:t xml:space="preserve">Naeini MP, Cooper G, Hauskrecht M (2015) Obtaining well calibrated probabilities using Bayesian binning. Proc AAAI Conf Artif Intell 29(1). https://doi.org/10.1609/aaai.v29i1.9602</w:t>
       </w:r>
     </w:p>
     <w:p>

</xml_diff>